<commit_message>
feat(submission): add editable figures, data and code, and the v3 talk
- every main and SI figure as an editable PPTX at its printed size
- figures_polished/: the redesigned main figures, numbered per journal
- data_and_code/: frozen reproducibility core with per-journal source data
- presentation/AOC2026_v3_redesign/: three visual styles plus Chinese
- SI rebuilt from the cleaned sources; GCB Fig. S15 now shows the wind roses
- upload zips are rebuilt locally and not tracked
</commit_message>
<xml_diff>
--- a/submission/GCB/Manuscript_GCB_tables_and_legends.docx
+++ b/submission/GCB/Manuscript_GCB_tables_and_legends.docx
@@ -36,13 +36,19 @@
         <w:tblLayout w:type="fixed"/>
         <w:tblLook w:firstRow="1" w:lastRow="0" w:firstColumn="0" w:lastColumn="0" w:noHBand="0" w:noVBand="0" w:val="0020"/>
         <w:tblBorders>
-          <w:top w:val="single" w:sz="4" w:color="auto"/>
-          <w:left w:val="single" w:sz="4" w:color="auto"/>
-          <w:bottom w:val="single" w:sz="4" w:color="auto"/>
-          <w:right w:val="single" w:sz="4" w:color="auto"/>
-          <w:insideH w:val="single" w:sz="4" w:color="auto"/>
-          <w:insideV w:val="single" w:sz="4" w:color="auto"/>
+          <w:top w:val="single" w:sz="8" w:color="auto"/>
+          <w:bottom w:val="single" w:sz="8" w:color="auto"/>
+          <w:left w:val="none" w:sz="0" w:color="auto"/>
+          <w:right w:val="none" w:sz="0" w:color="auto"/>
+          <w:insideH w:val="none" w:sz="0" w:color="auto"/>
+          <w:insideV w:val="none" w:sz="0" w:color="auto"/>
         </w:tblBorders>
+        <w:tblCellMar>
+          <w:top w:w="40" w:type="dxa"/>
+          <w:bottom w:w="40" w:type="dxa"/>
+          <w:left w:w="80" w:type="dxa"/>
+          <w:right w:w="80" w:type="dxa"/>
+        </w:tblCellMar>
       </w:tblPr>
       <w:tblGrid>
         <w:gridCol w:w="990"/>
@@ -59,15 +65,21 @@
           <w:tblHeader w:val="on"/>
         </w:trPr>
         <w:tc>
-          <w:tcPr/>
-          <w:p>
-            <w:pPr>
-              <w:pStyle w:val="Compact"/>
-              <w:spacing w:line="240" w:lineRule="auto" w:after="0"/>
-            </w:pPr>
-            <w:r>
-              <w:rPr>
-                <w:rFonts w:ascii="Times New Roman" w:hAnsi="Times New Roman"/>
+          <w:tcPr>
+            <w:tcBorders>
+              <w:bottom w:val="single" w:sz="4" w:color="auto"/>
+            </w:tcBorders>
+            <w:vAlign w:val="center"/>
+          </w:tcPr>
+          <w:p>
+            <w:pPr>
+              <w:pStyle w:val="Compact"/>
+              <w:spacing w:line="240" w:lineRule="auto" w:after="0"/>
+            </w:pPr>
+            <w:r>
+              <w:rPr>
+                <w:rFonts w:ascii="Times New Roman" w:hAnsi="Times New Roman"/>
+                <w:b/>
                 <w:sz w:val="16"/>
               </w:rPr>
               <w:t xml:space="preserve">Step</w:t>
@@ -75,15 +87,21 @@
           </w:p>
         </w:tc>
         <w:tc>
-          <w:tcPr/>
-          <w:p>
-            <w:pPr>
-              <w:pStyle w:val="Compact"/>
-              <w:spacing w:line="240" w:lineRule="auto" w:after="0"/>
-            </w:pPr>
-            <w:r>
-              <w:rPr>
-                <w:rFonts w:ascii="Times New Roman" w:hAnsi="Times New Roman"/>
+          <w:tcPr>
+            <w:tcBorders>
+              <w:bottom w:val="single" w:sz="4" w:color="auto"/>
+            </w:tcBorders>
+            <w:vAlign w:val="center"/>
+          </w:tcPr>
+          <w:p>
+            <w:pPr>
+              <w:pStyle w:val="Compact"/>
+              <w:spacing w:line="240" w:lineRule="auto" w:after="0"/>
+            </w:pPr>
+            <w:r>
+              <w:rPr>
+                <w:rFonts w:ascii="Times New Roman" w:hAnsi="Times New Roman"/>
+                <w:b/>
                 <w:sz w:val="16"/>
               </w:rPr>
               <w:t xml:space="preserve">Change</w:t>
@@ -91,15 +109,21 @@
           </w:p>
         </w:tc>
         <w:tc>
-          <w:tcPr/>
-          <w:p>
-            <w:pPr>
-              <w:pStyle w:val="Compact"/>
-              <w:spacing w:line="240" w:lineRule="auto" w:after="0"/>
-            </w:pPr>
-            <w:r>
-              <w:rPr>
-                <w:rFonts w:ascii="Times New Roman" w:hAnsi="Times New Roman"/>
+          <w:tcPr>
+            <w:tcBorders>
+              <w:bottom w:val="single" w:sz="4" w:color="auto"/>
+            </w:tcBorders>
+            <w:vAlign w:val="center"/>
+          </w:tcPr>
+          <w:p>
+            <w:pPr>
+              <w:pStyle w:val="Compact"/>
+              <w:spacing w:line="240" w:lineRule="auto" w:after="0"/>
+            </w:pPr>
+            <w:r>
+              <w:rPr>
+                <w:rFonts w:ascii="Times New Roman" w:hAnsi="Times New Roman"/>
+                <w:b/>
                 <w:i/>
                 <w:iCs/>
                 <w:sz w:val="16"/>
@@ -109,15 +133,21 @@
           </w:p>
         </w:tc>
         <w:tc>
-          <w:tcPr/>
-          <w:p>
-            <w:pPr>
-              <w:pStyle w:val="Compact"/>
-              <w:spacing w:line="240" w:lineRule="auto" w:after="0"/>
-            </w:pPr>
-            <w:r>
-              <w:rPr>
-                <w:rFonts w:ascii="Times New Roman" w:hAnsi="Times New Roman"/>
+          <w:tcPr>
+            <w:tcBorders>
+              <w:bottom w:val="single" w:sz="4" w:color="auto"/>
+            </w:tcBorders>
+            <w:vAlign w:val="center"/>
+          </w:tcPr>
+          <w:p>
+            <w:pPr>
+              <w:pStyle w:val="Compact"/>
+              <w:spacing w:line="240" w:lineRule="auto" w:after="0"/>
+            </w:pPr>
+            <w:r>
+              <w:rPr>
+                <w:rFonts w:ascii="Times New Roman" w:hAnsi="Times New Roman"/>
+                <w:b/>
                 <w:sz w:val="16"/>
               </w:rPr>
               <w:t xml:space="preserve">Events</w:t>
@@ -125,15 +155,21 @@
           </w:p>
         </w:tc>
         <w:tc>
-          <w:tcPr/>
-          <w:p>
-            <w:pPr>
-              <w:pStyle w:val="Compact"/>
-              <w:spacing w:line="240" w:lineRule="auto" w:after="0"/>
-            </w:pPr>
-            <w:r>
-              <w:rPr>
-                <w:rFonts w:ascii="Times New Roman" w:hAnsi="Times New Roman"/>
+          <w:tcPr>
+            <w:tcBorders>
+              <w:bottom w:val="single" w:sz="4" w:color="auto"/>
+            </w:tcBorders>
+            <w:vAlign w:val="center"/>
+          </w:tcPr>
+          <w:p>
+            <w:pPr>
+              <w:pStyle w:val="Compact"/>
+              <w:spacing w:line="240" w:lineRule="auto" w:after="0"/>
+            </w:pPr>
+            <w:r>
+              <w:rPr>
+                <w:rFonts w:ascii="Times New Roman" w:hAnsi="Times New Roman"/>
+                <w:b/>
                 <w:sz w:val="16"/>
               </w:rPr>
               <w:t xml:space="preserve">HR effort</w:t>
@@ -141,15 +177,21 @@
           </w:p>
         </w:tc>
         <w:tc>
-          <w:tcPr/>
-          <w:p>
-            <w:pPr>
-              <w:pStyle w:val="Compact"/>
-              <w:spacing w:line="240" w:lineRule="auto" w:after="0"/>
-            </w:pPr>
-            <w:r>
-              <w:rPr>
-                <w:rFonts w:ascii="Times New Roman" w:hAnsi="Times New Roman"/>
+          <w:tcPr>
+            <w:tcBorders>
+              <w:bottom w:val="single" w:sz="4" w:color="auto"/>
+            </w:tcBorders>
+            <w:vAlign w:val="center"/>
+          </w:tcPr>
+          <w:p>
+            <w:pPr>
+              <w:pStyle w:val="Compact"/>
+              <w:spacing w:line="240" w:lineRule="auto" w:after="0"/>
+            </w:pPr>
+            <w:r>
+              <w:rPr>
+                <w:rFonts w:ascii="Times New Roman" w:hAnsi="Times New Roman"/>
+                <w:b/>
                 <w:sz w:val="16"/>
               </w:rPr>
               <w:t xml:space="preserve">HR warming</w:t>
@@ -157,15 +199,21 @@
           </w:p>
         </w:tc>
         <w:tc>
-          <w:tcPr/>
-          <w:p>
-            <w:pPr>
-              <w:pStyle w:val="Compact"/>
-              <w:spacing w:line="240" w:lineRule="auto" w:after="0"/>
-            </w:pPr>
-            <w:r>
-              <w:rPr>
-                <w:rFonts w:ascii="Times New Roman" w:hAnsi="Times New Roman"/>
+          <w:tcPr>
+            <w:tcBorders>
+              <w:bottom w:val="single" w:sz="4" w:color="auto"/>
+            </w:tcBorders>
+            <w:vAlign w:val="center"/>
+          </w:tcPr>
+          <w:p>
+            <w:pPr>
+              <w:pStyle w:val="Compact"/>
+              <w:spacing w:line="240" w:lineRule="auto" w:after="0"/>
+            </w:pPr>
+            <w:r>
+              <w:rPr>
+                <w:rFonts w:ascii="Times New Roman" w:hAnsi="Times New Roman"/>
+                <w:b/>
                 <w:sz w:val="16"/>
               </w:rPr>
               <w:t xml:space="preserve">HR variability</w:t>
@@ -173,15 +221,21 @@
           </w:p>
         </w:tc>
         <w:tc>
-          <w:tcPr/>
-          <w:p>
-            <w:pPr>
-              <w:pStyle w:val="Compact"/>
-              <w:spacing w:line="240" w:lineRule="auto" w:after="0"/>
-            </w:pPr>
-            <w:r>
-              <w:rPr>
-                <w:rFonts w:ascii="Times New Roman" w:hAnsi="Times New Roman"/>
+          <w:tcPr>
+            <w:tcBorders>
+              <w:bottom w:val="single" w:sz="4" w:color="auto"/>
+            </w:tcBorders>
+            <w:vAlign w:val="center"/>
+          </w:tcPr>
+          <w:p>
+            <w:pPr>
+              <w:pStyle w:val="Compact"/>
+              <w:spacing w:line="240" w:lineRule="auto" w:after="0"/>
+            </w:pPr>
+            <w:r>
+              <w:rPr>
+                <w:rFonts w:ascii="Times New Roman" w:hAnsi="Times New Roman"/>
+                <w:b/>
                 <w:sz w:val="16"/>
               </w:rPr>
               <w:t xml:space="preserve">HR interaction</w:t>
@@ -191,7 +245,9 @@
       </w:tr>
       <w:tr>
         <w:tc>
-          <w:tcPr/>
+          <w:tcPr>
+            <w:vAlign w:val="center"/>
+          </w:tcPr>
           <w:p>
             <w:pPr>
               <w:pStyle w:val="Compact"/>
@@ -207,7 +263,9 @@
           </w:p>
         </w:tc>
         <w:tc>
-          <w:tcPr/>
+          <w:tcPr>
+            <w:vAlign w:val="center"/>
+          </w:tcPr>
           <w:p>
             <w:pPr>
               <w:pStyle w:val="Compact"/>
@@ -223,7 +281,9 @@
           </w:p>
         </w:tc>
         <w:tc>
-          <w:tcPr/>
+          <w:tcPr>
+            <w:vAlign w:val="center"/>
+          </w:tcPr>
           <w:p>
             <w:pPr>
               <w:pStyle w:val="Compact"/>
@@ -239,7 +299,9 @@
           </w:p>
         </w:tc>
         <w:tc>
-          <w:tcPr/>
+          <w:tcPr>
+            <w:vAlign w:val="center"/>
+          </w:tcPr>
           <w:p>
             <w:pPr>
               <w:pStyle w:val="Compact"/>
@@ -255,7 +317,9 @@
           </w:p>
         </w:tc>
         <w:tc>
-          <w:tcPr/>
+          <w:tcPr>
+            <w:vAlign w:val="center"/>
+          </w:tcPr>
           <w:p>
             <w:pPr>
               <w:pStyle w:val="Compact"/>
@@ -271,7 +335,9 @@
           </w:p>
         </w:tc>
         <w:tc>
-          <w:tcPr/>
+          <w:tcPr>
+            <w:vAlign w:val="center"/>
+          </w:tcPr>
           <w:p>
             <w:pPr>
               <w:pStyle w:val="Compact"/>
@@ -287,7 +353,9 @@
           </w:p>
         </w:tc>
         <w:tc>
-          <w:tcPr/>
+          <w:tcPr>
+            <w:vAlign w:val="center"/>
+          </w:tcPr>
           <w:p>
             <w:pPr>
               <w:pStyle w:val="Compact"/>
@@ -303,7 +371,9 @@
           </w:p>
         </w:tc>
         <w:tc>
-          <w:tcPr/>
+          <w:tcPr>
+            <w:vAlign w:val="center"/>
+          </w:tcPr>
           <w:p>
             <w:pPr>
               <w:pStyle w:val="Compact"/>
@@ -321,7 +391,9 @@
       </w:tr>
       <w:tr>
         <w:tc>
-          <w:tcPr/>
+          <w:tcPr>
+            <w:vAlign w:val="center"/>
+          </w:tcPr>
           <w:p>
             <w:pPr>
               <w:pStyle w:val="Compact"/>
@@ -337,7 +409,9 @@
           </w:p>
         </w:tc>
         <w:tc>
-          <w:tcPr/>
+          <w:tcPr>
+            <w:vAlign w:val="center"/>
+          </w:tcPr>
           <w:p>
             <w:pPr>
               <w:pStyle w:val="Compact"/>
@@ -353,7 +427,9 @@
           </w:p>
         </w:tc>
         <w:tc>
-          <w:tcPr/>
+          <w:tcPr>
+            <w:vAlign w:val="center"/>
+          </w:tcPr>
           <w:p>
             <w:pPr>
               <w:pStyle w:val="Compact"/>
@@ -369,7 +445,9 @@
           </w:p>
         </w:tc>
         <w:tc>
-          <w:tcPr/>
+          <w:tcPr>
+            <w:vAlign w:val="center"/>
+          </w:tcPr>
           <w:p>
             <w:pPr>
               <w:pStyle w:val="Compact"/>
@@ -385,7 +463,9 @@
           </w:p>
         </w:tc>
         <w:tc>
-          <w:tcPr/>
+          <w:tcPr>
+            <w:vAlign w:val="center"/>
+          </w:tcPr>
           <w:p>
             <w:pPr>
               <w:pStyle w:val="Compact"/>
@@ -401,7 +481,9 @@
           </w:p>
         </w:tc>
         <w:tc>
-          <w:tcPr/>
+          <w:tcPr>
+            <w:vAlign w:val="center"/>
+          </w:tcPr>
           <w:p>
             <w:pPr>
               <w:pStyle w:val="Compact"/>
@@ -417,7 +499,9 @@
           </w:p>
         </w:tc>
         <w:tc>
-          <w:tcPr/>
+          <w:tcPr>
+            <w:vAlign w:val="center"/>
+          </w:tcPr>
           <w:p>
             <w:pPr>
               <w:pStyle w:val="Compact"/>
@@ -433,7 +517,9 @@
           </w:p>
         </w:tc>
         <w:tc>
-          <w:tcPr/>
+          <w:tcPr>
+            <w:vAlign w:val="center"/>
+          </w:tcPr>
           <w:p>
             <w:pPr>
               <w:pStyle w:val="Compact"/>
@@ -451,7 +537,9 @@
       </w:tr>
       <w:tr>
         <w:tc>
-          <w:tcPr/>
+          <w:tcPr>
+            <w:vAlign w:val="center"/>
+          </w:tcPr>
           <w:p>
             <w:pPr>
               <w:pStyle w:val="Compact"/>
@@ -467,7 +555,9 @@
           </w:p>
         </w:tc>
         <w:tc>
-          <w:tcPr/>
+          <w:tcPr>
+            <w:vAlign w:val="center"/>
+          </w:tcPr>
           <w:p>
             <w:pPr>
               <w:pStyle w:val="Compact"/>
@@ -483,7 +573,9 @@
           </w:p>
         </w:tc>
         <w:tc>
-          <w:tcPr/>
+          <w:tcPr>
+            <w:vAlign w:val="center"/>
+          </w:tcPr>
           <w:p>
             <w:pPr>
               <w:pStyle w:val="Compact"/>
@@ -499,7 +591,9 @@
           </w:p>
         </w:tc>
         <w:tc>
-          <w:tcPr/>
+          <w:tcPr>
+            <w:vAlign w:val="center"/>
+          </w:tcPr>
           <w:p>
             <w:pPr>
               <w:pStyle w:val="Compact"/>
@@ -515,7 +609,9 @@
           </w:p>
         </w:tc>
         <w:tc>
-          <w:tcPr/>
+          <w:tcPr>
+            <w:vAlign w:val="center"/>
+          </w:tcPr>
           <w:p>
             <w:pPr>
               <w:pStyle w:val="Compact"/>
@@ -531,7 +627,9 @@
           </w:p>
         </w:tc>
         <w:tc>
-          <w:tcPr/>
+          <w:tcPr>
+            <w:vAlign w:val="center"/>
+          </w:tcPr>
           <w:p>
             <w:pPr>
               <w:pStyle w:val="Compact"/>
@@ -547,7 +645,9 @@
           </w:p>
         </w:tc>
         <w:tc>
-          <w:tcPr/>
+          <w:tcPr>
+            <w:vAlign w:val="center"/>
+          </w:tcPr>
           <w:p>
             <w:pPr>
               <w:pStyle w:val="Compact"/>
@@ -563,7 +663,9 @@
           </w:p>
         </w:tc>
         <w:tc>
-          <w:tcPr/>
+          <w:tcPr>
+            <w:vAlign w:val="center"/>
+          </w:tcPr>
           <w:p>
             <w:pPr>
               <w:pStyle w:val="Compact"/>
@@ -581,7 +683,9 @@
       </w:tr>
       <w:tr>
         <w:tc>
-          <w:tcPr/>
+          <w:tcPr>
+            <w:vAlign w:val="center"/>
+          </w:tcPr>
           <w:p>
             <w:pPr>
               <w:pStyle w:val="Compact"/>
@@ -597,7 +701,9 @@
           </w:p>
         </w:tc>
         <w:tc>
-          <w:tcPr/>
+          <w:tcPr>
+            <w:vAlign w:val="center"/>
+          </w:tcPr>
           <w:p>
             <w:pPr>
               <w:pStyle w:val="Compact"/>
@@ -613,7 +719,9 @@
           </w:p>
         </w:tc>
         <w:tc>
-          <w:tcPr/>
+          <w:tcPr>
+            <w:vAlign w:val="center"/>
+          </w:tcPr>
           <w:p>
             <w:pPr>
               <w:pStyle w:val="Compact"/>
@@ -629,7 +737,9 @@
           </w:p>
         </w:tc>
         <w:tc>
-          <w:tcPr/>
+          <w:tcPr>
+            <w:vAlign w:val="center"/>
+          </w:tcPr>
           <w:p>
             <w:pPr>
               <w:pStyle w:val="Compact"/>
@@ -645,7 +755,9 @@
           </w:p>
         </w:tc>
         <w:tc>
-          <w:tcPr/>
+          <w:tcPr>
+            <w:vAlign w:val="center"/>
+          </w:tcPr>
           <w:p>
             <w:pPr>
               <w:pStyle w:val="Compact"/>
@@ -661,7 +773,9 @@
           </w:p>
         </w:tc>
         <w:tc>
-          <w:tcPr/>
+          <w:tcPr>
+            <w:vAlign w:val="center"/>
+          </w:tcPr>
           <w:p>
             <w:pPr>
               <w:pStyle w:val="Compact"/>
@@ -677,7 +791,9 @@
           </w:p>
         </w:tc>
         <w:tc>
-          <w:tcPr/>
+          <w:tcPr>
+            <w:vAlign w:val="center"/>
+          </w:tcPr>
           <w:p>
             <w:pPr>
               <w:pStyle w:val="Compact"/>
@@ -693,7 +809,9 @@
           </w:p>
         </w:tc>
         <w:tc>
-          <w:tcPr/>
+          <w:tcPr>
+            <w:vAlign w:val="center"/>
+          </w:tcPr>
           <w:p>
             <w:pPr>
               <w:pStyle w:val="Compact"/>
@@ -711,7 +829,9 @@
       </w:tr>
       <w:tr>
         <w:tc>
-          <w:tcPr/>
+          <w:tcPr>
+            <w:vAlign w:val="center"/>
+          </w:tcPr>
           <w:p>
             <w:pPr>
               <w:pStyle w:val="Compact"/>
@@ -727,7 +847,9 @@
           </w:p>
         </w:tc>
         <w:tc>
-          <w:tcPr/>
+          <w:tcPr>
+            <w:vAlign w:val="center"/>
+          </w:tcPr>
           <w:p>
             <w:pPr>
               <w:pStyle w:val="Compact"/>
@@ -743,7 +865,9 @@
           </w:p>
         </w:tc>
         <w:tc>
-          <w:tcPr/>
+          <w:tcPr>
+            <w:vAlign w:val="center"/>
+          </w:tcPr>
           <w:p>
             <w:pPr>
               <w:pStyle w:val="Compact"/>
@@ -759,7 +883,9 @@
           </w:p>
         </w:tc>
         <w:tc>
-          <w:tcPr/>
+          <w:tcPr>
+            <w:vAlign w:val="center"/>
+          </w:tcPr>
           <w:p>
             <w:pPr>
               <w:pStyle w:val="Compact"/>
@@ -775,7 +901,9 @@
           </w:p>
         </w:tc>
         <w:tc>
-          <w:tcPr/>
+          <w:tcPr>
+            <w:vAlign w:val="center"/>
+          </w:tcPr>
           <w:p>
             <w:pPr>
               <w:pStyle w:val="Compact"/>
@@ -791,7 +919,9 @@
           </w:p>
         </w:tc>
         <w:tc>
-          <w:tcPr/>
+          <w:tcPr>
+            <w:vAlign w:val="center"/>
+          </w:tcPr>
           <w:p>
             <w:pPr>
               <w:pStyle w:val="Compact"/>
@@ -807,7 +937,9 @@
           </w:p>
         </w:tc>
         <w:tc>
-          <w:tcPr/>
+          <w:tcPr>
+            <w:vAlign w:val="center"/>
+          </w:tcPr>
           <w:p>
             <w:pPr>
               <w:pStyle w:val="Compact"/>
@@ -823,7 +955,9 @@
           </w:p>
         </w:tc>
         <w:tc>
-          <w:tcPr/>
+          <w:tcPr>
+            <w:vAlign w:val="center"/>
+          </w:tcPr>
           <w:p>
             <w:pPr>
               <w:pStyle w:val="Compact"/>
@@ -841,7 +975,9 @@
       </w:tr>
       <w:tr>
         <w:tc>
-          <w:tcPr/>
+          <w:tcPr>
+            <w:vAlign w:val="center"/>
+          </w:tcPr>
           <w:p>
             <w:pPr>
               <w:pStyle w:val="Compact"/>
@@ -857,7 +993,9 @@
           </w:p>
         </w:tc>
         <w:tc>
-          <w:tcPr/>
+          <w:tcPr>
+            <w:vAlign w:val="center"/>
+          </w:tcPr>
           <w:p>
             <w:pPr>
               <w:pStyle w:val="Compact"/>
@@ -873,7 +1011,9 @@
           </w:p>
         </w:tc>
         <w:tc>
-          <w:tcPr/>
+          <w:tcPr>
+            <w:vAlign w:val="center"/>
+          </w:tcPr>
           <w:p>
             <w:pPr>
               <w:pStyle w:val="Compact"/>
@@ -889,7 +1029,9 @@
           </w:p>
         </w:tc>
         <w:tc>
-          <w:tcPr/>
+          <w:tcPr>
+            <w:vAlign w:val="center"/>
+          </w:tcPr>
           <w:p>
             <w:pPr>
               <w:pStyle w:val="Compact"/>
@@ -905,7 +1047,9 @@
           </w:p>
         </w:tc>
         <w:tc>
-          <w:tcPr/>
+          <w:tcPr>
+            <w:vAlign w:val="center"/>
+          </w:tcPr>
           <w:p>
             <w:pPr>
               <w:pStyle w:val="Compact"/>
@@ -923,7 +1067,9 @@
           </w:p>
         </w:tc>
         <w:tc>
-          <w:tcPr/>
+          <w:tcPr>
+            <w:vAlign w:val="center"/>
+          </w:tcPr>
           <w:p>
             <w:pPr>
               <w:pStyle w:val="Compact"/>
@@ -941,7 +1087,9 @@
           </w:p>
         </w:tc>
         <w:tc>
-          <w:tcPr/>
+          <w:tcPr>
+            <w:vAlign w:val="center"/>
+          </w:tcPr>
           <w:p>
             <w:pPr>
               <w:pStyle w:val="Compact"/>
@@ -959,7 +1107,9 @@
           </w:p>
         </w:tc>
         <w:tc>
-          <w:tcPr/>
+          <w:tcPr>
+            <w:vAlign w:val="center"/>
+          </w:tcPr>
           <w:p>
             <w:pPr>
               <w:pStyle w:val="Compact"/>
@@ -1019,13 +1169,19 @@
         <w:tblLayout w:type="fixed"/>
         <w:tblLook w:firstRow="1" w:lastRow="0" w:firstColumn="0" w:lastColumn="0" w:noHBand="0" w:noVBand="0" w:val="0020"/>
         <w:tblBorders>
-          <w:top w:val="single" w:sz="4" w:color="auto"/>
-          <w:left w:val="single" w:sz="4" w:color="auto"/>
-          <w:bottom w:val="single" w:sz="4" w:color="auto"/>
-          <w:right w:val="single" w:sz="4" w:color="auto"/>
-          <w:insideH w:val="single" w:sz="4" w:color="auto"/>
-          <w:insideV w:val="single" w:sz="4" w:color="auto"/>
+          <w:top w:val="single" w:sz="8" w:color="auto"/>
+          <w:bottom w:val="single" w:sz="8" w:color="auto"/>
+          <w:left w:val="none" w:sz="0" w:color="auto"/>
+          <w:right w:val="none" w:sz="0" w:color="auto"/>
+          <w:insideH w:val="none" w:sz="0" w:color="auto"/>
+          <w:insideV w:val="none" w:sz="0" w:color="auto"/>
         </w:tblBorders>
+        <w:tblCellMar>
+          <w:top w:w="40" w:type="dxa"/>
+          <w:bottom w:w="40" w:type="dxa"/>
+          <w:left w:w="80" w:type="dxa"/>
+          <w:right w:w="80" w:type="dxa"/>
+        </w:tblCellMar>
       </w:tblPr>
       <w:tblGrid>
         <w:gridCol w:w="1320"/>
@@ -1040,15 +1196,21 @@
           <w:tblHeader w:val="on"/>
         </w:trPr>
         <w:tc>
-          <w:tcPr/>
-          <w:p>
-            <w:pPr>
-              <w:pStyle w:val="Compact"/>
-              <w:spacing w:line="240" w:lineRule="auto" w:after="0"/>
-            </w:pPr>
-            <w:r>
-              <w:rPr>
-                <w:rFonts w:ascii="Times New Roman" w:hAnsi="Times New Roman"/>
+          <w:tcPr>
+            <w:tcBorders>
+              <w:bottom w:val="single" w:sz="4" w:color="auto"/>
+            </w:tcBorders>
+            <w:vAlign w:val="center"/>
+          </w:tcPr>
+          <w:p>
+            <w:pPr>
+              <w:pStyle w:val="Compact"/>
+              <w:spacing w:line="240" w:lineRule="auto" w:after="0"/>
+            </w:pPr>
+            <w:r>
+              <w:rPr>
+                <w:rFonts w:ascii="Times New Roman" w:hAnsi="Times New Roman"/>
+                <w:b/>
                 <w:sz w:val="16"/>
               </w:rPr>
               <w:t xml:space="preserve">Term</w:t>
@@ -1056,15 +1218,21 @@
           </w:p>
         </w:tc>
         <w:tc>
-          <w:tcPr/>
-          <w:p>
-            <w:pPr>
-              <w:pStyle w:val="Compact"/>
-              <w:spacing w:line="240" w:lineRule="auto" w:after="0"/>
-            </w:pPr>
-            <w:r>
-              <w:rPr>
-                <w:rFonts w:ascii="Times New Roman" w:hAnsi="Times New Roman"/>
+          <w:tcPr>
+            <w:tcBorders>
+              <w:bottom w:val="single" w:sz="4" w:color="auto"/>
+            </w:tcBorders>
+            <w:vAlign w:val="center"/>
+          </w:tcPr>
+          <w:p>
+            <w:pPr>
+              <w:pStyle w:val="Compact"/>
+              <w:spacing w:line="240" w:lineRule="auto" w:after="0"/>
+            </w:pPr>
+            <w:r>
+              <w:rPr>
+                <w:rFonts w:ascii="Times New Roman" w:hAnsi="Times New Roman"/>
+                <w:b/>
                 <w:sz w:val="16"/>
               </w:rPr>
               <w:t xml:space="preserve">HR per SD</w:t>
@@ -1072,15 +1240,21 @@
           </w:p>
         </w:tc>
         <w:tc>
-          <w:tcPr/>
-          <w:p>
-            <w:pPr>
-              <w:pStyle w:val="Compact"/>
-              <w:spacing w:line="240" w:lineRule="auto" w:after="0"/>
-            </w:pPr>
-            <w:r>
-              <w:rPr>
-                <w:rFonts w:ascii="Times New Roman" w:hAnsi="Times New Roman"/>
+          <w:tcPr>
+            <w:tcBorders>
+              <w:bottom w:val="single" w:sz="4" w:color="auto"/>
+            </w:tcBorders>
+            <w:vAlign w:val="center"/>
+          </w:tcPr>
+          <w:p>
+            <w:pPr>
+              <w:pStyle w:val="Compact"/>
+              <w:spacing w:line="240" w:lineRule="auto" w:after="0"/>
+            </w:pPr>
+            <w:r>
+              <w:rPr>
+                <w:rFonts w:ascii="Times New Roman" w:hAnsi="Times New Roman"/>
+                <w:b/>
                 <w:sz w:val="16"/>
               </w:rPr>
               <w:t xml:space="preserve">95% CI (Wald)</w:t>
@@ -1088,15 +1262,21 @@
           </w:p>
         </w:tc>
         <w:tc>
-          <w:tcPr/>
-          <w:p>
-            <w:pPr>
-              <w:pStyle w:val="Compact"/>
-              <w:spacing w:line="240" w:lineRule="auto" w:after="0"/>
-            </w:pPr>
-            <w:r>
-              <w:rPr>
-                <w:rFonts w:ascii="Times New Roman" w:hAnsi="Times New Roman"/>
+          <w:tcPr>
+            <w:tcBorders>
+              <w:bottom w:val="single" w:sz="4" w:color="auto"/>
+            </w:tcBorders>
+            <w:vAlign w:val="center"/>
+          </w:tcPr>
+          <w:p>
+            <w:pPr>
+              <w:pStyle w:val="Compact"/>
+              <w:spacing w:line="240" w:lineRule="auto" w:after="0"/>
+            </w:pPr>
+            <w:r>
+              <w:rPr>
+                <w:rFonts w:ascii="Times New Roman" w:hAnsi="Times New Roman"/>
+                <w:b/>
                 <w:sz w:val="16"/>
               </w:rPr>
               <w:t xml:space="preserve">95% CI (province cluster bootstrap)</w:t>
@@ -1104,15 +1284,21 @@
           </w:p>
         </w:tc>
         <w:tc>
-          <w:tcPr/>
-          <w:p>
-            <w:pPr>
-              <w:pStyle w:val="Compact"/>
-              <w:spacing w:line="240" w:lineRule="auto" w:after="0"/>
-            </w:pPr>
-            <w:r>
-              <w:rPr>
-                <w:rFonts w:ascii="Times New Roman" w:hAnsi="Times New Roman"/>
+          <w:tcPr>
+            <w:tcBorders>
+              <w:bottom w:val="single" w:sz="4" w:color="auto"/>
+            </w:tcBorders>
+            <w:vAlign w:val="center"/>
+          </w:tcPr>
+          <w:p>
+            <w:pPr>
+              <w:pStyle w:val="Compact"/>
+              <w:spacing w:line="240" w:lineRule="auto" w:after="0"/>
+            </w:pPr>
+            <w:r>
+              <w:rPr>
+                <w:rFonts w:ascii="Times New Roman" w:hAnsi="Times New Roman"/>
+                <w:b/>
                 <w:sz w:val="16"/>
               </w:rPr>
               <w:t xml:space="preserve">Permutation null median</w:t>
@@ -1120,15 +1306,21 @@
           </w:p>
         </w:tc>
         <w:tc>
-          <w:tcPr/>
-          <w:p>
-            <w:pPr>
-              <w:pStyle w:val="Compact"/>
-              <w:spacing w:line="240" w:lineRule="auto" w:after="0"/>
-            </w:pPr>
-            <w:r>
-              <w:rPr>
-                <w:rFonts w:ascii="Times New Roman" w:hAnsi="Times New Roman"/>
+          <w:tcPr>
+            <w:tcBorders>
+              <w:bottom w:val="single" w:sz="4" w:color="auto"/>
+            </w:tcBorders>
+            <w:vAlign w:val="center"/>
+          </w:tcPr>
+          <w:p>
+            <w:pPr>
+              <w:pStyle w:val="Compact"/>
+              <w:spacing w:line="240" w:lineRule="auto" w:after="0"/>
+            </w:pPr>
+            <w:r>
+              <w:rPr>
+                <w:rFonts w:ascii="Times New Roman" w:hAnsi="Times New Roman"/>
+                <w:b/>
                 <w:i/>
                 <w:iCs/>
                 <w:sz w:val="16"/>
@@ -1140,7 +1332,9 @@
       </w:tr>
       <w:tr>
         <w:tc>
-          <w:tcPr/>
+          <w:tcPr>
+            <w:vAlign w:val="center"/>
+          </w:tcPr>
           <w:p>
             <w:pPr>
               <w:pStyle w:val="Compact"/>
@@ -1156,7 +1350,9 @@
           </w:p>
         </w:tc>
         <w:tc>
-          <w:tcPr/>
+          <w:tcPr>
+            <w:vAlign w:val="center"/>
+          </w:tcPr>
           <w:p>
             <w:pPr>
               <w:pStyle w:val="Compact"/>
@@ -1172,7 +1368,9 @@
           </w:p>
         </w:tc>
         <w:tc>
-          <w:tcPr/>
+          <w:tcPr>
+            <w:vAlign w:val="center"/>
+          </w:tcPr>
           <w:p>
             <w:pPr>
               <w:pStyle w:val="Compact"/>
@@ -1188,7 +1386,9 @@
           </w:p>
         </w:tc>
         <w:tc>
-          <w:tcPr/>
+          <w:tcPr>
+            <w:vAlign w:val="center"/>
+          </w:tcPr>
           <w:p>
             <w:pPr>
               <w:pStyle w:val="Compact"/>
@@ -1204,7 +1404,9 @@
           </w:p>
         </w:tc>
         <w:tc>
-          <w:tcPr/>
+          <w:tcPr>
+            <w:vAlign w:val="center"/>
+          </w:tcPr>
           <w:p>
             <w:pPr>
               <w:pStyle w:val="Compact"/>
@@ -1220,7 +1422,9 @@
           </w:p>
         </w:tc>
         <w:tc>
-          <w:tcPr/>
+          <w:tcPr>
+            <w:vAlign w:val="center"/>
+          </w:tcPr>
           <w:p>
             <w:pPr>
               <w:pStyle w:val="Compact"/>
@@ -1238,7 +1442,9 @@
       </w:tr>
       <w:tr>
         <w:tc>
-          <w:tcPr/>
+          <w:tcPr>
+            <w:vAlign w:val="center"/>
+          </w:tcPr>
           <w:p>
             <w:pPr>
               <w:pStyle w:val="Compact"/>
@@ -1254,7 +1460,9 @@
           </w:p>
         </w:tc>
         <w:tc>
-          <w:tcPr/>
+          <w:tcPr>
+            <w:vAlign w:val="center"/>
+          </w:tcPr>
           <w:p>
             <w:pPr>
               <w:pStyle w:val="Compact"/>
@@ -1270,7 +1478,9 @@
           </w:p>
         </w:tc>
         <w:tc>
-          <w:tcPr/>
+          <w:tcPr>
+            <w:vAlign w:val="center"/>
+          </w:tcPr>
           <w:p>
             <w:pPr>
               <w:pStyle w:val="Compact"/>
@@ -1286,7 +1496,9 @@
           </w:p>
         </w:tc>
         <w:tc>
-          <w:tcPr/>
+          <w:tcPr>
+            <w:vAlign w:val="center"/>
+          </w:tcPr>
           <w:p>
             <w:pPr>
               <w:pStyle w:val="Compact"/>
@@ -1302,7 +1514,9 @@
           </w:p>
         </w:tc>
         <w:tc>
-          <w:tcPr/>
+          <w:tcPr>
+            <w:vAlign w:val="center"/>
+          </w:tcPr>
           <w:p>
             <w:pPr>
               <w:pStyle w:val="Compact"/>
@@ -1318,7 +1532,9 @@
           </w:p>
         </w:tc>
         <w:tc>
-          <w:tcPr/>
+          <w:tcPr>
+            <w:vAlign w:val="center"/>
+          </w:tcPr>
           <w:p>
             <w:pPr>
               <w:pStyle w:val="Compact"/>
@@ -1336,7 +1552,9 @@
       </w:tr>
       <w:tr>
         <w:tc>
-          <w:tcPr/>
+          <w:tcPr>
+            <w:vAlign w:val="center"/>
+          </w:tcPr>
           <w:p>
             <w:pPr>
               <w:pStyle w:val="Compact"/>
@@ -1352,7 +1570,9 @@
           </w:p>
         </w:tc>
         <w:tc>
-          <w:tcPr/>
+          <w:tcPr>
+            <w:vAlign w:val="center"/>
+          </w:tcPr>
           <w:p>
             <w:pPr>
               <w:pStyle w:val="Compact"/>
@@ -1368,7 +1588,9 @@
           </w:p>
         </w:tc>
         <w:tc>
-          <w:tcPr/>
+          <w:tcPr>
+            <w:vAlign w:val="center"/>
+          </w:tcPr>
           <w:p>
             <w:pPr>
               <w:pStyle w:val="Compact"/>
@@ -1384,7 +1606,9 @@
           </w:p>
         </w:tc>
         <w:tc>
-          <w:tcPr/>
+          <w:tcPr>
+            <w:vAlign w:val="center"/>
+          </w:tcPr>
           <w:p>
             <w:pPr>
               <w:pStyle w:val="Compact"/>
@@ -1400,7 +1624,9 @@
           </w:p>
         </w:tc>
         <w:tc>
-          <w:tcPr/>
+          <w:tcPr>
+            <w:vAlign w:val="center"/>
+          </w:tcPr>
           <w:p>
             <w:pPr>
               <w:pStyle w:val="Compact"/>
@@ -1416,7 +1642,9 @@
           </w:p>
         </w:tc>
         <w:tc>
-          <w:tcPr/>
+          <w:tcPr>
+            <w:vAlign w:val="center"/>
+          </w:tcPr>
           <w:p>
             <w:pPr>
               <w:pStyle w:val="Compact"/>
@@ -1434,7 +1662,9 @@
       </w:tr>
       <w:tr>
         <w:tc>
-          <w:tcPr/>
+          <w:tcPr>
+            <w:vAlign w:val="center"/>
+          </w:tcPr>
           <w:p>
             <w:pPr>
               <w:pStyle w:val="Compact"/>
@@ -1450,7 +1680,9 @@
           </w:p>
         </w:tc>
         <w:tc>
-          <w:tcPr/>
+          <w:tcPr>
+            <w:vAlign w:val="center"/>
+          </w:tcPr>
           <w:p>
             <w:pPr>
               <w:pStyle w:val="Compact"/>
@@ -1466,7 +1698,9 @@
           </w:p>
         </w:tc>
         <w:tc>
-          <w:tcPr/>
+          <w:tcPr>
+            <w:vAlign w:val="center"/>
+          </w:tcPr>
           <w:p>
             <w:pPr>
               <w:pStyle w:val="Compact"/>
@@ -1482,7 +1716,9 @@
           </w:p>
         </w:tc>
         <w:tc>
-          <w:tcPr/>
+          <w:tcPr>
+            <w:vAlign w:val="center"/>
+          </w:tcPr>
           <w:p>
             <w:pPr>
               <w:pStyle w:val="Compact"/>
@@ -1498,7 +1734,9 @@
           </w:p>
         </w:tc>
         <w:tc>
-          <w:tcPr/>
+          <w:tcPr>
+            <w:vAlign w:val="center"/>
+          </w:tcPr>
           <w:p>
             <w:pPr>
               <w:pStyle w:val="Compact"/>
@@ -1514,7 +1752,9 @@
           </w:p>
         </w:tc>
         <w:tc>
-          <w:tcPr/>
+          <w:tcPr>
+            <w:vAlign w:val="center"/>
+          </w:tcPr>
           <w:p>
             <w:pPr>
               <w:pStyle w:val="Compact"/>
@@ -1532,7 +1772,9 @@
       </w:tr>
       <w:tr>
         <w:tc>
-          <w:tcPr/>
+          <w:tcPr>
+            <w:vAlign w:val="center"/>
+          </w:tcPr>
           <w:p>
             <w:pPr>
               <w:pStyle w:val="Compact"/>
@@ -1548,7 +1790,9 @@
           </w:p>
         </w:tc>
         <w:tc>
-          <w:tcPr/>
+          <w:tcPr>
+            <w:vAlign w:val="center"/>
+          </w:tcPr>
           <w:p>
             <w:pPr>
               <w:pStyle w:val="Compact"/>
@@ -1564,34 +1808,42 @@
           </w:p>
         </w:tc>
         <w:tc>
-          <w:tcPr/>
-          <w:p>
-            <w:pPr>
-              <w:pStyle w:val="Compact"/>
-              <w:spacing w:line="240" w:lineRule="auto" w:after="0"/>
-            </w:pPr>
-          </w:p>
-        </w:tc>
-        <w:tc>
-          <w:tcPr/>
-          <w:p>
-            <w:pPr>
-              <w:pStyle w:val="Compact"/>
-              <w:spacing w:line="240" w:lineRule="auto" w:after="0"/>
-            </w:pPr>
-          </w:p>
-        </w:tc>
-        <w:tc>
-          <w:tcPr/>
-          <w:p>
-            <w:pPr>
-              <w:pStyle w:val="Compact"/>
-              <w:spacing w:line="240" w:lineRule="auto" w:after="0"/>
-            </w:pPr>
-          </w:p>
-        </w:tc>
-        <w:tc>
-          <w:tcPr/>
+          <w:tcPr>
+            <w:vAlign w:val="center"/>
+          </w:tcPr>
+          <w:p>
+            <w:pPr>
+              <w:pStyle w:val="Compact"/>
+              <w:spacing w:line="240" w:lineRule="auto" w:after="0"/>
+            </w:pPr>
+          </w:p>
+        </w:tc>
+        <w:tc>
+          <w:tcPr>
+            <w:vAlign w:val="center"/>
+          </w:tcPr>
+          <w:p>
+            <w:pPr>
+              <w:pStyle w:val="Compact"/>
+              <w:spacing w:line="240" w:lineRule="auto" w:after="0"/>
+            </w:pPr>
+          </w:p>
+        </w:tc>
+        <w:tc>
+          <w:tcPr>
+            <w:vAlign w:val="center"/>
+          </w:tcPr>
+          <w:p>
+            <w:pPr>
+              <w:pStyle w:val="Compact"/>
+              <w:spacing w:line="240" w:lineRule="auto" w:after="0"/>
+            </w:pPr>
+          </w:p>
+        </w:tc>
+        <w:tc>
+          <w:tcPr>
+            <w:vAlign w:val="center"/>
+          </w:tcPr>
           <w:p>
             <w:pPr>
               <w:pStyle w:val="Compact"/>
@@ -1602,7 +1854,9 @@
       </w:tr>
       <w:tr>
         <w:tc>
-          <w:tcPr/>
+          <w:tcPr>
+            <w:vAlign w:val="center"/>
+          </w:tcPr>
           <w:p>
             <w:pPr>
               <w:pStyle w:val="Compact"/>
@@ -1618,7 +1872,9 @@
           </w:p>
         </w:tc>
         <w:tc>
-          <w:tcPr/>
+          <w:tcPr>
+            <w:vAlign w:val="center"/>
+          </w:tcPr>
           <w:p>
             <w:pPr>
               <w:pStyle w:val="Compact"/>
@@ -1634,34 +1890,42 @@
           </w:p>
         </w:tc>
         <w:tc>
-          <w:tcPr/>
-          <w:p>
-            <w:pPr>
-              <w:pStyle w:val="Compact"/>
-              <w:spacing w:line="240" w:lineRule="auto" w:after="0"/>
-            </w:pPr>
-          </w:p>
-        </w:tc>
-        <w:tc>
-          <w:tcPr/>
-          <w:p>
-            <w:pPr>
-              <w:pStyle w:val="Compact"/>
-              <w:spacing w:line="240" w:lineRule="auto" w:after="0"/>
-            </w:pPr>
-          </w:p>
-        </w:tc>
-        <w:tc>
-          <w:tcPr/>
-          <w:p>
-            <w:pPr>
-              <w:pStyle w:val="Compact"/>
-              <w:spacing w:line="240" w:lineRule="auto" w:after="0"/>
-            </w:pPr>
-          </w:p>
-        </w:tc>
-        <w:tc>
-          <w:tcPr/>
+          <w:tcPr>
+            <w:vAlign w:val="center"/>
+          </w:tcPr>
+          <w:p>
+            <w:pPr>
+              <w:pStyle w:val="Compact"/>
+              <w:spacing w:line="240" w:lineRule="auto" w:after="0"/>
+            </w:pPr>
+          </w:p>
+        </w:tc>
+        <w:tc>
+          <w:tcPr>
+            <w:vAlign w:val="center"/>
+          </w:tcPr>
+          <w:p>
+            <w:pPr>
+              <w:pStyle w:val="Compact"/>
+              <w:spacing w:line="240" w:lineRule="auto" w:after="0"/>
+            </w:pPr>
+          </w:p>
+        </w:tc>
+        <w:tc>
+          <w:tcPr>
+            <w:vAlign w:val="center"/>
+          </w:tcPr>
+          <w:p>
+            <w:pPr>
+              <w:pStyle w:val="Compact"/>
+              <w:spacing w:line="240" w:lineRule="auto" w:after="0"/>
+            </w:pPr>
+          </w:p>
+        </w:tc>
+        <w:tc>
+          <w:tcPr>
+            <w:vAlign w:val="center"/>
+          </w:tcPr>
           <w:p>
             <w:pPr>
               <w:pStyle w:val="Compact"/>
@@ -1672,7 +1936,9 @@
       </w:tr>
       <w:tr>
         <w:tc>
-          <w:tcPr/>
+          <w:tcPr>
+            <w:vAlign w:val="center"/>
+          </w:tcPr>
           <w:p>
             <w:pPr>
               <w:pStyle w:val="Compact"/>
@@ -1688,7 +1954,9 @@
           </w:p>
         </w:tc>
         <w:tc>
-          <w:tcPr/>
+          <w:tcPr>
+            <w:vAlign w:val="center"/>
+          </w:tcPr>
           <w:p>
             <w:pPr>
               <w:pStyle w:val="Compact"/>
@@ -1704,34 +1972,42 @@
           </w:p>
         </w:tc>
         <w:tc>
-          <w:tcPr/>
-          <w:p>
-            <w:pPr>
-              <w:pStyle w:val="Compact"/>
-              <w:spacing w:line="240" w:lineRule="auto" w:after="0"/>
-            </w:pPr>
-          </w:p>
-        </w:tc>
-        <w:tc>
-          <w:tcPr/>
-          <w:p>
-            <w:pPr>
-              <w:pStyle w:val="Compact"/>
-              <w:spacing w:line="240" w:lineRule="auto" w:after="0"/>
-            </w:pPr>
-          </w:p>
-        </w:tc>
-        <w:tc>
-          <w:tcPr/>
-          <w:p>
-            <w:pPr>
-              <w:pStyle w:val="Compact"/>
-              <w:spacing w:line="240" w:lineRule="auto" w:after="0"/>
-            </w:pPr>
-          </w:p>
-        </w:tc>
-        <w:tc>
-          <w:tcPr/>
+          <w:tcPr>
+            <w:vAlign w:val="center"/>
+          </w:tcPr>
+          <w:p>
+            <w:pPr>
+              <w:pStyle w:val="Compact"/>
+              <w:spacing w:line="240" w:lineRule="auto" w:after="0"/>
+            </w:pPr>
+          </w:p>
+        </w:tc>
+        <w:tc>
+          <w:tcPr>
+            <w:vAlign w:val="center"/>
+          </w:tcPr>
+          <w:p>
+            <w:pPr>
+              <w:pStyle w:val="Compact"/>
+              <w:spacing w:line="240" w:lineRule="auto" w:after="0"/>
+            </w:pPr>
+          </w:p>
+        </w:tc>
+        <w:tc>
+          <w:tcPr>
+            <w:vAlign w:val="center"/>
+          </w:tcPr>
+          <w:p>
+            <w:pPr>
+              <w:pStyle w:val="Compact"/>
+              <w:spacing w:line="240" w:lineRule="auto" w:after="0"/>
+            </w:pPr>
+          </w:p>
+        </w:tc>
+        <w:tc>
+          <w:tcPr>
+            <w:vAlign w:val="center"/>
+          </w:tcPr>
           <w:p>
             <w:pPr>
               <w:pStyle w:val="Compact"/>
@@ -1766,13 +2042,19 @@
         <w:tblLayout w:type="fixed"/>
         <w:tblLook w:firstRow="1" w:lastRow="0" w:firstColumn="0" w:lastColumn="0" w:noHBand="0" w:noVBand="0" w:val="0020"/>
         <w:tblBorders>
-          <w:top w:val="single" w:sz="4" w:color="auto"/>
-          <w:left w:val="single" w:sz="4" w:color="auto"/>
-          <w:bottom w:val="single" w:sz="4" w:color="auto"/>
-          <w:right w:val="single" w:sz="4" w:color="auto"/>
-          <w:insideH w:val="single" w:sz="4" w:color="auto"/>
-          <w:insideV w:val="single" w:sz="4" w:color="auto"/>
+          <w:top w:val="single" w:sz="8" w:color="auto"/>
+          <w:bottom w:val="single" w:sz="8" w:color="auto"/>
+          <w:left w:val="none" w:sz="0" w:color="auto"/>
+          <w:right w:val="none" w:sz="0" w:color="auto"/>
+          <w:insideH w:val="none" w:sz="0" w:color="auto"/>
+          <w:insideV w:val="none" w:sz="0" w:color="auto"/>
         </w:tblBorders>
+        <w:tblCellMar>
+          <w:top w:w="40" w:type="dxa"/>
+          <w:bottom w:w="40" w:type="dxa"/>
+          <w:left w:w="80" w:type="dxa"/>
+          <w:right w:w="80" w:type="dxa"/>
+        </w:tblCellMar>
       </w:tblPr>
       <w:tblGrid>
         <w:gridCol w:w="990"/>
@@ -1789,15 +2071,21 @@
           <w:tblHeader w:val="on"/>
         </w:trPr>
         <w:tc>
-          <w:tcPr/>
-          <w:p>
-            <w:pPr>
-              <w:pStyle w:val="Compact"/>
-              <w:spacing w:line="240" w:lineRule="auto" w:after="0"/>
-            </w:pPr>
-            <w:r>
-              <w:rPr>
-                <w:rFonts w:ascii="Times New Roman" w:hAnsi="Times New Roman"/>
+          <w:tcPr>
+            <w:tcBorders>
+              <w:bottom w:val="single" w:sz="4" w:color="auto"/>
+            </w:tcBorders>
+            <w:vAlign w:val="center"/>
+          </w:tcPr>
+          <w:p>
+            <w:pPr>
+              <w:pStyle w:val="Compact"/>
+              <w:spacing w:line="240" w:lineRule="auto" w:after="0"/>
+            </w:pPr>
+            <w:r>
+              <w:rPr>
+                <w:rFonts w:ascii="Times New Roman" w:hAnsi="Times New Roman"/>
+                <w:b/>
                 <w:sz w:val="16"/>
               </w:rPr>
               <w:t xml:space="preserve">Structure</w:t>
@@ -1805,15 +2093,21 @@
           </w:p>
         </w:tc>
         <w:tc>
-          <w:tcPr/>
-          <w:p>
-            <w:pPr>
-              <w:pStyle w:val="Compact"/>
-              <w:spacing w:line="240" w:lineRule="auto" w:after="0"/>
-            </w:pPr>
-            <w:r>
-              <w:rPr>
-                <w:rFonts w:ascii="Times New Roman" w:hAnsi="Times New Roman"/>
+          <w:tcPr>
+            <w:tcBorders>
+              <w:bottom w:val="single" w:sz="4" w:color="auto"/>
+            </w:tcBorders>
+            <w:vAlign w:val="center"/>
+          </w:tcPr>
+          <w:p>
+            <w:pPr>
+              <w:pStyle w:val="Compact"/>
+              <w:spacing w:line="240" w:lineRule="auto" w:after="0"/>
+            </w:pPr>
+            <w:r>
+              <w:rPr>
+                <w:rFonts w:ascii="Times New Roman" w:hAnsi="Times New Roman"/>
+                <w:b/>
                 <w:sz w:val="16"/>
               </w:rPr>
               <w:t xml:space="preserve">ΔAIC</w:t>
@@ -1821,15 +2115,21 @@
           </w:p>
         </w:tc>
         <w:tc>
-          <w:tcPr/>
-          <w:p>
-            <w:pPr>
-              <w:pStyle w:val="Compact"/>
-              <w:spacing w:line="240" w:lineRule="auto" w:after="0"/>
-            </w:pPr>
-            <w:r>
-              <w:rPr>
-                <w:rFonts w:ascii="Times New Roman" w:hAnsi="Times New Roman"/>
+          <w:tcPr>
+            <w:tcBorders>
+              <w:bottom w:val="single" w:sz="4" w:color="auto"/>
+            </w:tcBorders>
+            <w:vAlign w:val="center"/>
+          </w:tcPr>
+          <w:p>
+            <w:pPr>
+              <w:pStyle w:val="Compact"/>
+              <w:spacing w:line="240" w:lineRule="auto" w:after="0"/>
+            </w:pPr>
+            <w:r>
+              <w:rPr>
+                <w:rFonts w:ascii="Times New Roman" w:hAnsi="Times New Roman"/>
+                <w:b/>
                 <w:sz w:val="16"/>
               </w:rPr>
               <w:t xml:space="preserve">McFadden</w:t>
@@ -1837,6 +2137,7 @@
             <w:r>
               <w:rPr>
                 <w:rFonts w:ascii="Times New Roman" w:hAnsi="Times New Roman"/>
+                <w:b/>
                 <w:sz w:val="16"/>
               </w:rPr>
               <w:t xml:space="preserve"> </w:t>
@@ -1844,6 +2145,7 @@
             <w:r>
               <w:rPr>
                 <w:rFonts w:ascii="Times New Roman" w:hAnsi="Times New Roman"/>
+                <w:b/>
                 <w:i/>
                 <w:iCs/>
                 <w:sz w:val="16"/>
@@ -1853,6 +2155,7 @@
             <w:r>
               <w:rPr>
                 <w:rFonts w:ascii="Times New Roman" w:hAnsi="Times New Roman"/>
+                <w:b/>
                 <w:sz w:val="16"/>
               </w:rPr>
               <w:t xml:space="preserve">²</w:t>
@@ -1860,15 +2163,21 @@
           </w:p>
         </w:tc>
         <w:tc>
-          <w:tcPr/>
-          <w:p>
-            <w:pPr>
-              <w:pStyle w:val="Compact"/>
-              <w:spacing w:line="240" w:lineRule="auto" w:after="0"/>
-            </w:pPr>
-            <w:r>
-              <w:rPr>
-                <w:rFonts w:ascii="Times New Roman" w:hAnsi="Times New Roman"/>
+          <w:tcPr>
+            <w:tcBorders>
+              <w:bottom w:val="single" w:sz="4" w:color="auto"/>
+            </w:tcBorders>
+            <w:vAlign w:val="center"/>
+          </w:tcPr>
+          <w:p>
+            <w:pPr>
+              <w:pStyle w:val="Compact"/>
+              <w:spacing w:line="240" w:lineRule="auto" w:after="0"/>
+            </w:pPr>
+            <w:r>
+              <w:rPr>
+                <w:rFonts w:ascii="Times New Roman" w:hAnsi="Times New Roman"/>
+                <w:b/>
                 <w:sz w:val="16"/>
               </w:rPr>
               <w:t xml:space="preserve">Marginal</w:t>
@@ -1876,6 +2185,7 @@
             <w:r>
               <w:rPr>
                 <w:rFonts w:ascii="Times New Roman" w:hAnsi="Times New Roman"/>
+                <w:b/>
                 <w:sz w:val="16"/>
               </w:rPr>
               <w:t xml:space="preserve"> </w:t>
@@ -1883,6 +2193,7 @@
             <w:r>
               <w:rPr>
                 <w:rFonts w:ascii="Times New Roman" w:hAnsi="Times New Roman"/>
+                <w:b/>
                 <w:i/>
                 <w:iCs/>
                 <w:sz w:val="16"/>
@@ -1892,6 +2203,7 @@
             <w:r>
               <w:rPr>
                 <w:rFonts w:ascii="Times New Roman" w:hAnsi="Times New Roman"/>
+                <w:b/>
                 <w:sz w:val="16"/>
               </w:rPr>
               <w:t xml:space="preserve">²</w:t>
@@ -1899,15 +2211,21 @@
           </w:p>
         </w:tc>
         <w:tc>
-          <w:tcPr/>
-          <w:p>
-            <w:pPr>
-              <w:pStyle w:val="Compact"/>
-              <w:spacing w:line="240" w:lineRule="auto" w:after="0"/>
-            </w:pPr>
-            <w:r>
-              <w:rPr>
-                <w:rFonts w:ascii="Times New Roman" w:hAnsi="Times New Roman"/>
+          <w:tcPr>
+            <w:tcBorders>
+              <w:bottom w:val="single" w:sz="4" w:color="auto"/>
+            </w:tcBorders>
+            <w:vAlign w:val="center"/>
+          </w:tcPr>
+          <w:p>
+            <w:pPr>
+              <w:pStyle w:val="Compact"/>
+              <w:spacing w:line="240" w:lineRule="auto" w:after="0"/>
+            </w:pPr>
+            <w:r>
+              <w:rPr>
+                <w:rFonts w:ascii="Times New Roman" w:hAnsi="Times New Roman"/>
+                <w:b/>
                 <w:sz w:val="16"/>
               </w:rPr>
               <w:t xml:space="preserve">Conditional</w:t>
@@ -1915,6 +2233,7 @@
             <w:r>
               <w:rPr>
                 <w:rFonts w:ascii="Times New Roman" w:hAnsi="Times New Roman"/>
+                <w:b/>
                 <w:sz w:val="16"/>
               </w:rPr>
               <w:t xml:space="preserve"> </w:t>
@@ -1922,6 +2241,7 @@
             <w:r>
               <w:rPr>
                 <w:rFonts w:ascii="Times New Roman" w:hAnsi="Times New Roman"/>
+                <w:b/>
                 <w:i/>
                 <w:iCs/>
                 <w:sz w:val="16"/>
@@ -1931,6 +2251,7 @@
             <w:r>
               <w:rPr>
                 <w:rFonts w:ascii="Times New Roman" w:hAnsi="Times New Roman"/>
+                <w:b/>
                 <w:sz w:val="16"/>
               </w:rPr>
               <w:t xml:space="preserve">²</w:t>
@@ -1938,15 +2259,21 @@
           </w:p>
         </w:tc>
         <w:tc>
-          <w:tcPr/>
-          <w:p>
-            <w:pPr>
-              <w:pStyle w:val="Compact"/>
-              <w:spacing w:line="240" w:lineRule="auto" w:after="0"/>
-            </w:pPr>
-            <w:r>
-              <w:rPr>
-                <w:rFonts w:ascii="Times New Roman" w:hAnsi="Times New Roman"/>
+          <w:tcPr>
+            <w:tcBorders>
+              <w:bottom w:val="single" w:sz="4" w:color="auto"/>
+            </w:tcBorders>
+            <w:vAlign w:val="center"/>
+          </w:tcPr>
+          <w:p>
+            <w:pPr>
+              <w:pStyle w:val="Compact"/>
+              <w:spacing w:line="240" w:lineRule="auto" w:after="0"/>
+            </w:pPr>
+            <w:r>
+              <w:rPr>
+                <w:rFonts w:ascii="Times New Roman" w:hAnsi="Times New Roman"/>
+                <w:b/>
                 <w:sz w:val="16"/>
               </w:rPr>
               <w:t xml:space="preserve">Marginal AUC</w:t>
@@ -1954,15 +2281,21 @@
           </w:p>
         </w:tc>
         <w:tc>
-          <w:tcPr/>
-          <w:p>
-            <w:pPr>
-              <w:pStyle w:val="Compact"/>
-              <w:spacing w:line="240" w:lineRule="auto" w:after="0"/>
-            </w:pPr>
-            <w:r>
-              <w:rPr>
-                <w:rFonts w:ascii="Times New Roman" w:hAnsi="Times New Roman"/>
+          <w:tcPr>
+            <w:tcBorders>
+              <w:bottom w:val="single" w:sz="4" w:color="auto"/>
+            </w:tcBorders>
+            <w:vAlign w:val="center"/>
+          </w:tcPr>
+          <w:p>
+            <w:pPr>
+              <w:pStyle w:val="Compact"/>
+              <w:spacing w:line="240" w:lineRule="auto" w:after="0"/>
+            </w:pPr>
+            <w:r>
+              <w:rPr>
+                <w:rFonts w:ascii="Times New Roman" w:hAnsi="Times New Roman"/>
+                <w:b/>
                 <w:sz w:val="16"/>
               </w:rPr>
               <w:t xml:space="preserve">Conditional AUC</w:t>
@@ -1970,15 +2303,21 @@
           </w:p>
         </w:tc>
         <w:tc>
-          <w:tcPr/>
-          <w:p>
-            <w:pPr>
-              <w:pStyle w:val="Compact"/>
-              <w:spacing w:line="240" w:lineRule="auto" w:after="0"/>
-            </w:pPr>
-            <w:r>
-              <w:rPr>
-                <w:rFonts w:ascii="Times New Roman" w:hAnsi="Times New Roman"/>
+          <w:tcPr>
+            <w:tcBorders>
+              <w:bottom w:val="single" w:sz="4" w:color="auto"/>
+            </w:tcBorders>
+            <w:vAlign w:val="center"/>
+          </w:tcPr>
+          <w:p>
+            <w:pPr>
+              <w:pStyle w:val="Compact"/>
+              <w:spacing w:line="240" w:lineRule="auto" w:after="0"/>
+            </w:pPr>
+            <w:r>
+              <w:rPr>
+                <w:rFonts w:ascii="Times New Roman" w:hAnsi="Times New Roman"/>
+                <w:b/>
                 <w:sz w:val="16"/>
               </w:rPr>
               <w:t xml:space="preserve">ICC</w:t>
@@ -1988,7 +2327,9 @@
       </w:tr>
       <w:tr>
         <w:tc>
-          <w:tcPr/>
+          <w:tcPr>
+            <w:vAlign w:val="center"/>
+          </w:tcPr>
           <w:p>
             <w:pPr>
               <w:pStyle w:val="Compact"/>
@@ -2004,7 +2345,9 @@
           </w:p>
         </w:tc>
         <w:tc>
-          <w:tcPr/>
+          <w:tcPr>
+            <w:vAlign w:val="center"/>
+          </w:tcPr>
           <w:p>
             <w:pPr>
               <w:pStyle w:val="Compact"/>
@@ -2020,7 +2363,9 @@
           </w:p>
         </w:tc>
         <w:tc>
-          <w:tcPr/>
+          <w:tcPr>
+            <w:vAlign w:val="center"/>
+          </w:tcPr>
           <w:p>
             <w:pPr>
               <w:pStyle w:val="Compact"/>
@@ -2036,7 +2381,9 @@
           </w:p>
         </w:tc>
         <w:tc>
-          <w:tcPr/>
+          <w:tcPr>
+            <w:vAlign w:val="center"/>
+          </w:tcPr>
           <w:p>
             <w:pPr>
               <w:pStyle w:val="Compact"/>
@@ -2052,7 +2399,9 @@
           </w:p>
         </w:tc>
         <w:tc>
-          <w:tcPr/>
+          <w:tcPr>
+            <w:vAlign w:val="center"/>
+          </w:tcPr>
           <w:p>
             <w:pPr>
               <w:pStyle w:val="Compact"/>
@@ -2068,7 +2417,9 @@
           </w:p>
         </w:tc>
         <w:tc>
-          <w:tcPr/>
+          <w:tcPr>
+            <w:vAlign w:val="center"/>
+          </w:tcPr>
           <w:p>
             <w:pPr>
               <w:pStyle w:val="Compact"/>
@@ -2084,7 +2435,9 @@
           </w:p>
         </w:tc>
         <w:tc>
-          <w:tcPr/>
+          <w:tcPr>
+            <w:vAlign w:val="center"/>
+          </w:tcPr>
           <w:p>
             <w:pPr>
               <w:pStyle w:val="Compact"/>
@@ -2100,7 +2453,9 @@
           </w:p>
         </w:tc>
         <w:tc>
-          <w:tcPr/>
+          <w:tcPr>
+            <w:vAlign w:val="center"/>
+          </w:tcPr>
           <w:p>
             <w:pPr>
               <w:pStyle w:val="Compact"/>
@@ -2118,7 +2473,9 @@
       </w:tr>
       <w:tr>
         <w:tc>
-          <w:tcPr/>
+          <w:tcPr>
+            <w:vAlign w:val="center"/>
+          </w:tcPr>
           <w:p>
             <w:pPr>
               <w:pStyle w:val="Compact"/>
@@ -2134,7 +2491,9 @@
           </w:p>
         </w:tc>
         <w:tc>
-          <w:tcPr/>
+          <w:tcPr>
+            <w:vAlign w:val="center"/>
+          </w:tcPr>
           <w:p>
             <w:pPr>
               <w:pStyle w:val="Compact"/>
@@ -2150,7 +2509,9 @@
           </w:p>
         </w:tc>
         <w:tc>
-          <w:tcPr/>
+          <w:tcPr>
+            <w:vAlign w:val="center"/>
+          </w:tcPr>
           <w:p>
             <w:pPr>
               <w:pStyle w:val="Compact"/>
@@ -2166,7 +2527,9 @@
           </w:p>
         </w:tc>
         <w:tc>
-          <w:tcPr/>
+          <w:tcPr>
+            <w:vAlign w:val="center"/>
+          </w:tcPr>
           <w:p>
             <w:pPr>
               <w:pStyle w:val="Compact"/>
@@ -2182,7 +2545,9 @@
           </w:p>
         </w:tc>
         <w:tc>
-          <w:tcPr/>
+          <w:tcPr>
+            <w:vAlign w:val="center"/>
+          </w:tcPr>
           <w:p>
             <w:pPr>
               <w:pStyle w:val="Compact"/>
@@ -2198,7 +2563,9 @@
           </w:p>
         </w:tc>
         <w:tc>
-          <w:tcPr/>
+          <w:tcPr>
+            <w:vAlign w:val="center"/>
+          </w:tcPr>
           <w:p>
             <w:pPr>
               <w:pStyle w:val="Compact"/>
@@ -2214,7 +2581,9 @@
           </w:p>
         </w:tc>
         <w:tc>
-          <w:tcPr/>
+          <w:tcPr>
+            <w:vAlign w:val="center"/>
+          </w:tcPr>
           <w:p>
             <w:pPr>
               <w:pStyle w:val="Compact"/>
@@ -2230,7 +2599,9 @@
           </w:p>
         </w:tc>
         <w:tc>
-          <w:tcPr/>
+          <w:tcPr>
+            <w:vAlign w:val="center"/>
+          </w:tcPr>
           <w:p>
             <w:pPr>
               <w:pStyle w:val="Compact"/>
@@ -2248,7 +2619,9 @@
       </w:tr>
       <w:tr>
         <w:tc>
-          <w:tcPr/>
+          <w:tcPr>
+            <w:vAlign w:val="center"/>
+          </w:tcPr>
           <w:p>
             <w:pPr>
               <w:pStyle w:val="Compact"/>
@@ -2264,7 +2637,9 @@
           </w:p>
         </w:tc>
         <w:tc>
-          <w:tcPr/>
+          <w:tcPr>
+            <w:vAlign w:val="center"/>
+          </w:tcPr>
           <w:p>
             <w:pPr>
               <w:pStyle w:val="Compact"/>
@@ -2280,7 +2655,9 @@
           </w:p>
         </w:tc>
         <w:tc>
-          <w:tcPr/>
+          <w:tcPr>
+            <w:vAlign w:val="center"/>
+          </w:tcPr>
           <w:p>
             <w:pPr>
               <w:pStyle w:val="Compact"/>
@@ -2296,7 +2673,9 @@
           </w:p>
         </w:tc>
         <w:tc>
-          <w:tcPr/>
+          <w:tcPr>
+            <w:vAlign w:val="center"/>
+          </w:tcPr>
           <w:p>
             <w:pPr>
               <w:pStyle w:val="Compact"/>
@@ -2312,7 +2691,9 @@
           </w:p>
         </w:tc>
         <w:tc>
-          <w:tcPr/>
+          <w:tcPr>
+            <w:vAlign w:val="center"/>
+          </w:tcPr>
           <w:p>
             <w:pPr>
               <w:pStyle w:val="Compact"/>
@@ -2328,7 +2709,9 @@
           </w:p>
         </w:tc>
         <w:tc>
-          <w:tcPr/>
+          <w:tcPr>
+            <w:vAlign w:val="center"/>
+          </w:tcPr>
           <w:p>
             <w:pPr>
               <w:pStyle w:val="Compact"/>
@@ -2344,7 +2727,9 @@
           </w:p>
         </w:tc>
         <w:tc>
-          <w:tcPr/>
+          <w:tcPr>
+            <w:vAlign w:val="center"/>
+          </w:tcPr>
           <w:p>
             <w:pPr>
               <w:pStyle w:val="Compact"/>
@@ -2360,7 +2745,9 @@
           </w:p>
         </w:tc>
         <w:tc>
-          <w:tcPr/>
+          <w:tcPr>
+            <w:vAlign w:val="center"/>
+          </w:tcPr>
           <w:p>
             <w:pPr>
               <w:pStyle w:val="Compact"/>
@@ -2378,7 +2765,9 @@
       </w:tr>
       <w:tr>
         <w:tc>
-          <w:tcPr/>
+          <w:tcPr>
+            <w:vAlign w:val="center"/>
+          </w:tcPr>
           <w:p>
             <w:pPr>
               <w:pStyle w:val="Compact"/>
@@ -2396,7 +2785,9 @@
           </w:p>
         </w:tc>
         <w:tc>
-          <w:tcPr/>
+          <w:tcPr>
+            <w:vAlign w:val="center"/>
+          </w:tcPr>
           <w:p>
             <w:pPr>
               <w:pStyle w:val="Compact"/>
@@ -2414,7 +2805,9 @@
           </w:p>
         </w:tc>
         <w:tc>
-          <w:tcPr/>
+          <w:tcPr>
+            <w:vAlign w:val="center"/>
+          </w:tcPr>
           <w:p>
             <w:pPr>
               <w:pStyle w:val="Compact"/>
@@ -2432,7 +2825,9 @@
           </w:p>
         </w:tc>
         <w:tc>
-          <w:tcPr/>
+          <w:tcPr>
+            <w:vAlign w:val="center"/>
+          </w:tcPr>
           <w:p>
             <w:pPr>
               <w:pStyle w:val="Compact"/>
@@ -2450,7 +2845,9 @@
           </w:p>
         </w:tc>
         <w:tc>
-          <w:tcPr/>
+          <w:tcPr>
+            <w:vAlign w:val="center"/>
+          </w:tcPr>
           <w:p>
             <w:pPr>
               <w:pStyle w:val="Compact"/>
@@ -2468,7 +2865,9 @@
           </w:p>
         </w:tc>
         <w:tc>
-          <w:tcPr/>
+          <w:tcPr>
+            <w:vAlign w:val="center"/>
+          </w:tcPr>
           <w:p>
             <w:pPr>
               <w:pStyle w:val="Compact"/>
@@ -2486,7 +2885,9 @@
           </w:p>
         </w:tc>
         <w:tc>
-          <w:tcPr/>
+          <w:tcPr>
+            <w:vAlign w:val="center"/>
+          </w:tcPr>
           <w:p>
             <w:pPr>
               <w:pStyle w:val="Compact"/>
@@ -2504,7 +2905,9 @@
           </w:p>
         </w:tc>
         <w:tc>
-          <w:tcPr/>
+          <w:tcPr>
+            <w:vAlign w:val="center"/>
+          </w:tcPr>
           <w:p>
             <w:pPr>
               <w:pStyle w:val="Compact"/>
@@ -2524,7 +2927,9 @@
       </w:tr>
       <w:tr>
         <w:tc>
-          <w:tcPr/>
+          <w:tcPr>
+            <w:vAlign w:val="center"/>
+          </w:tcPr>
           <w:p>
             <w:pPr>
               <w:pStyle w:val="Compact"/>
@@ -2540,7 +2945,9 @@
           </w:p>
         </w:tc>
         <w:tc>
-          <w:tcPr/>
+          <w:tcPr>
+            <w:vAlign w:val="center"/>
+          </w:tcPr>
           <w:p>
             <w:pPr>
               <w:pStyle w:val="Compact"/>
@@ -2556,7 +2963,9 @@
           </w:p>
         </w:tc>
         <w:tc>
-          <w:tcPr/>
+          <w:tcPr>
+            <w:vAlign w:val="center"/>
+          </w:tcPr>
           <w:p>
             <w:pPr>
               <w:pStyle w:val="Compact"/>
@@ -2572,7 +2981,9 @@
           </w:p>
         </w:tc>
         <w:tc>
-          <w:tcPr/>
+          <w:tcPr>
+            <w:vAlign w:val="center"/>
+          </w:tcPr>
           <w:p>
             <w:pPr>
               <w:pStyle w:val="Compact"/>
@@ -2588,7 +2999,9 @@
           </w:p>
         </w:tc>
         <w:tc>
-          <w:tcPr/>
+          <w:tcPr>
+            <w:vAlign w:val="center"/>
+          </w:tcPr>
           <w:p>
             <w:pPr>
               <w:pStyle w:val="Compact"/>
@@ -2604,7 +3017,9 @@
           </w:p>
         </w:tc>
         <w:tc>
-          <w:tcPr/>
+          <w:tcPr>
+            <w:vAlign w:val="center"/>
+          </w:tcPr>
           <w:p>
             <w:pPr>
               <w:pStyle w:val="Compact"/>
@@ -2620,7 +3035,9 @@
           </w:p>
         </w:tc>
         <w:tc>
-          <w:tcPr/>
+          <w:tcPr>
+            <w:vAlign w:val="center"/>
+          </w:tcPr>
           <w:p>
             <w:pPr>
               <w:pStyle w:val="Compact"/>
@@ -2636,7 +3053,9 @@
           </w:p>
         </w:tc>
         <w:tc>
-          <w:tcPr/>
+          <w:tcPr>
+            <w:vAlign w:val="center"/>
+          </w:tcPr>
           <w:p>
             <w:pPr>
               <w:pStyle w:val="Compact"/>
@@ -2654,7 +3073,9 @@
       </w:tr>
       <w:tr>
         <w:tc>
-          <w:tcPr/>
+          <w:tcPr>
+            <w:vAlign w:val="center"/>
+          </w:tcPr>
           <w:p>
             <w:pPr>
               <w:pStyle w:val="Compact"/>
@@ -2670,7 +3091,9 @@
           </w:p>
         </w:tc>
         <w:tc>
-          <w:tcPr/>
+          <w:tcPr>
+            <w:vAlign w:val="center"/>
+          </w:tcPr>
           <w:p>
             <w:pPr>
               <w:pStyle w:val="Compact"/>
@@ -2686,7 +3109,9 @@
           </w:p>
         </w:tc>
         <w:tc>
-          <w:tcPr/>
+          <w:tcPr>
+            <w:vAlign w:val="center"/>
+          </w:tcPr>
           <w:p>
             <w:pPr>
               <w:pStyle w:val="Compact"/>
@@ -2702,7 +3127,9 @@
           </w:p>
         </w:tc>
         <w:tc>
-          <w:tcPr/>
+          <w:tcPr>
+            <w:vAlign w:val="center"/>
+          </w:tcPr>
           <w:p>
             <w:pPr>
               <w:pStyle w:val="Compact"/>
@@ -2718,7 +3145,9 @@
           </w:p>
         </w:tc>
         <w:tc>
-          <w:tcPr/>
+          <w:tcPr>
+            <w:vAlign w:val="center"/>
+          </w:tcPr>
           <w:p>
             <w:pPr>
               <w:pStyle w:val="Compact"/>
@@ -2734,7 +3163,9 @@
           </w:p>
         </w:tc>
         <w:tc>
-          <w:tcPr/>
+          <w:tcPr>
+            <w:vAlign w:val="center"/>
+          </w:tcPr>
           <w:p>
             <w:pPr>
               <w:pStyle w:val="Compact"/>
@@ -2750,7 +3181,9 @@
           </w:p>
         </w:tc>
         <w:tc>
-          <w:tcPr/>
+          <w:tcPr>
+            <w:vAlign w:val="center"/>
+          </w:tcPr>
           <w:p>
             <w:pPr>
               <w:pStyle w:val="Compact"/>
@@ -2766,7 +3199,9 @@
           </w:p>
         </w:tc>
         <w:tc>
-          <w:tcPr/>
+          <w:tcPr>
+            <w:vAlign w:val="center"/>
+          </w:tcPr>
           <w:p>
             <w:pPr>
               <w:pStyle w:val="Compact"/>
@@ -2815,7 +3250,23 @@
         <w:t xml:space="preserve">a</w:t>
       </w:r>
       <w:r>
-        <w:t xml:space="preserve">, Hazard ratios per standard deviation with 95% Wald confidence intervals, for the four fixed effects, at three species-distribution-model thresholds. The dashed line marks unity. Note that unity is not the appropriate null for the warming terms: design-preserving permutation nulls that retain the provincial-annual climate and event structure are centred on 1.16 for accumulated warming and 0.96 for the interaction (Extended Data Figure 4a), so the increment attributable to species-specific referencing is smaller than the distance from unity suggests.</w:t>
+        <w:t xml:space="preserve">, Hazard ratios per standard deviation with 95% Wald confidence intervals, for the four fixed effects, at three species-distribution-model thresholds (main threshold:</w:t>
+      </w:r>
+      <w:r>
+        <w:t xml:space="preserve"> </w:t>
+      </w:r>
+      <w:r>
+        <w:rPr>
+          <w:i/>
+          <w:iCs/>
+        </w:rPr>
+        <w:t xml:space="preserve">n</w:t>
+      </w:r>
+      <w:r>
+        <w:t xml:space="preserve"> </w:t>
+      </w:r>
+      <w:r>
+        <w:t xml:space="preserve">= 175,901 species × province × year cells, 649 events). The dashed line marks unity. Note that unity is not the appropriate null for the warming terms: design-preserving permutation nulls that retain the provincial-annual climate and event structure are centred on 1.16 for accumulated warming and 0.96 for the interaction (Supplementary Fig. S11a), so the increment attributable to species-specific referencing is smaller than the distance from unity suggests.</w:t>
       </w:r>
       <w:r>
         <w:t xml:space="preserve"> </w:t>
@@ -2867,7 +3318,7 @@
         <w:t xml:space="preserve">d</w:t>
       </w:r>
       <w:r>
-        <w:t xml:space="preserve">, Discrimination attributable to fixed effects alone as terms are added, with the random structure held at the main model.</w:t>
+        <w:t xml:space="preserve">, Discrimination (area under the ROC curve, AUC) attributable to fixed effects alone as terms are added, with the random structure held at the main model.</w:t>
       </w:r>
     </w:p>
     <w:p>
@@ -2892,7 +3343,7 @@
         <w:t xml:space="preserve">a</w:t>
       </w:r>
       <w:r>
-        <w:t xml:space="preserve">, Distribution of the delay between discovery and publication (bars, left axis as per cent of records) and the resulting reporting completeness</w:t>
+        <w:t xml:space="preserve">, Distribution of the delay between discovery and publication (bars, left axis as per cent of the 1,028 records with a parseable discovery year) and the resulting reporting completeness</w:t>
       </w:r>
       <w:r>
         <w:t xml:space="preserve"> </w:t>
@@ -2941,7 +3392,7 @@
         <w:t xml:space="preserve">c</w:t>
       </w:r>
       <w:r>
-        <w:t xml:space="preserve">, Hazard ratios for the four fixed effects across the five-step decomposition from the previously published specification (S0) to the corrected main model (S5). The shaded column marks the re-dating step.</w:t>
+        <w:t xml:space="preserve">, Hazard ratios (point estimates) for the four fixed effects across the five-step decomposition from the previously published specification (S0) to the corrected main model (S5). The shaded column marks the re-dating step.</w:t>
       </w:r>
     </w:p>
     <w:p>
@@ -2966,7 +3417,42 @@
         <w:t xml:space="preserve">a</w:t>
       </w:r>
       <w:r>
-        <w:t xml:space="preserve">, Hazard ratio for accumulated warming across four climate indicators and four accumulation windows; asterisks denote significance.</w:t>
+        <w:t xml:space="preserve">, Hazard ratio for accumulated warming across four climate indicators and four accumulation windows; asterisks denote two-sided Wald</w:t>
+      </w:r>
+      <w:r>
+        <w:t xml:space="preserve"> </w:t>
+      </w:r>
+      <w:r>
+        <w:rPr>
+          <w:i/>
+          <w:iCs/>
+        </w:rPr>
+        <w:t xml:space="preserve">P</w:t>
+      </w:r>
+      <w:r>
+        <w:t xml:space="preserve"> </w:t>
+      </w:r>
+      <w:r>
+        <w:t xml:space="preserve">&lt; 0.05 (</w:t>
+      </w:r>
+      <w:r>
+        <w:rPr>
+          <w:i/>
+          <w:iCs/>
+        </w:rPr>
+        <w:t xml:space="preserve">), &lt; 0.01 (</w:t>
+      </w:r>
+      <w:r>
+        <w:rPr>
+          <w:b/>
+          <w:bCs/>
+          <w:i/>
+          <w:iCs/>
+        </w:rPr>
+        <w:t xml:space="preserve">) and &lt; 0.001 (</w:t>
+      </w:r>
+      <w:r>
+        <w:t xml:space="preserve">).</w:t>
       </w:r>
       <w:r>
         <w:t xml:space="preserve"> </w:t>
@@ -2992,7 +3478,7 @@
         <w:t xml:space="preserve">c</w:t>
       </w:r>
       <w:r>
-        <w:t xml:space="preserve">, Hazard ratios for survey effort (triangles) and accumulated warming (circles) across four effort proxies and three treatments of the 24 implausible zero cells. AIC is not comparable across missing-data rules because the sample sizes differ, so only coefficients are shown.</w:t>
+        <w:t xml:space="preserve">, Hazard ratios with 95% Wald confidence intervals for survey effort (triangles) and accumulated warming (circles) across four effort proxies and three treatments of the 24 implausible zero cells. AIC is not comparable across missing-data rules because the sample sizes differ, so only coefficients are shown.</w:t>
       </w:r>
     </w:p>
     <w:p>
@@ -3126,7 +3612,20 @@
         <w:t xml:space="preserve">a</w:t>
       </w:r>
       <w:r>
-        <w:t xml:space="preserve">, Species random intercepts as hazard multipliers, grouped by migratory strategy; diamonds are group medians.</w:t>
+        <w:t xml:space="preserve">, Species random intercepts as hazard multipliers (</w:t>
+      </w:r>
+      <w:r>
+        <w:rPr>
+          <w:i/>
+          <w:iCs/>
+        </w:rPr>
+        <w:t xml:space="preserve">n</w:t>
+      </w:r>
+      <w:r>
+        <w:t xml:space="preserve"> </w:t>
+      </w:r>
+      <w:r>
+        <w:t xml:space="preserve">= 392 species), grouped by migratory strategy; diamonds are group medians.</w:t>
       </w:r>
       <w:r>
         <w:t xml:space="preserve"> </w:t>
@@ -3165,7 +3664,23 @@
         <w:t xml:space="preserve">d</w:t>
       </w:r>
       <w:r>
-        <w:t xml:space="preserve">, Hazard ratio for survey effort as a function of year, from the model that allows effects to vary through time; the ribbon is the 95% confidence interval.</w:t>
+        <w:t xml:space="preserve">, Hazard ratio for survey effort as a function of year, from the model that allows effects to vary through time; the ribbon is the 95% confidence interval (effort × time interaction, Wald</w:t>
+      </w:r>
+      <w:r>
+        <w:t xml:space="preserve"> </w:t>
+      </w:r>
+      <w:r>
+        <w:rPr>
+          <w:i/>
+          <w:iCs/>
+        </w:rPr>
+        <w:t xml:space="preserve">P</w:t>
+      </w:r>
+      <w:r>
+        <w:t xml:space="preserve"> </w:t>
+      </w:r>
+      <w:r>
+        <w:t xml:space="preserve">= 7.7 × 10⁻⁴). Map lines delineate study areas and do not necessarily depict accepted national boundaries. Base map: standard map GS(2019)1822.</w:t>
       </w:r>
     </w:p>
     <w:p>
@@ -3177,13 +3692,110 @@
           <w:b/>
           <w:bCs/>
         </w:rPr>
-        <w:t xml:space="preserve">Figure 6 | Directionality of new records relative to the species’ known range.</w:t>
+        <w:t xml:space="preserve">Figure 6 | Direction of new records relative to species’ range centroids, against geometric and observational nulls.</w:t>
       </w:r>
       <w:r>
         <w:t xml:space="preserve"> </w:t>
       </w:r>
       <w:r>
-        <w:t xml:space="preserve">Bearing from the centroid of each species’ BirdLife range to the record, binned into eight 45° sectors. Radar and wind-rose forms are provided for the overall data, for the six largest orders overlaid, and for each of the sixteen best-sampled orders individually. Every order panel carries both sample sizes, new records and species, because one species can contribute records in several provinces. Overlay panels use each order’s own proportions; absolute sample sizes are in the legend.</w:t>
+        <w:rPr>
+          <w:b/>
+          <w:bCs/>
+        </w:rPr>
+        <w:t xml:space="preserve">a</w:t>
+      </w:r>
+      <w:r>
+        <w:t xml:space="preserve">, Share of the 642 records with a range centroid in each of eight 45° sectors of bearing from the centroid of the species’ global range (solid line), with the shares expected if each record fell at random among its species’ candidate provinces (dashed; geometry) or among them in proportion to their 2002–2024 survey visits (dotted; geometry + effort), from 999 Monte Carlo draws.</w:t>
+      </w:r>
+      <w:r>
+        <w:t xml:space="preserve"> </w:t>
+      </w:r>
+      <w:r>
+        <w:rPr>
+          <w:b/>
+          <w:bCs/>
+        </w:rPr>
+        <w:t xml:space="preserve">b</w:t>
+      </w:r>
+      <w:r>
+        <w:t xml:space="preserve">, Ratio of observed to expected records per sector under the two nulls (log scale); bars show the 95% Monte Carlo interval of the null expressed as a ratio, and filled points mark sectors with Holm-adjusted two-sided</w:t>
+      </w:r>
+      <w:r>
+        <w:t xml:space="preserve"> </w:t>
+      </w:r>
+      <w:r>
+        <w:rPr>
+          <w:i/>
+          <w:iCs/>
+        </w:rPr>
+        <w:t xml:space="preserve">P</w:t>
+      </w:r>
+      <w:r>
+        <w:t xml:space="preserve"> </w:t>
+      </w:r>
+      <w:r>
+        <w:t xml:space="preserve">&lt; 0.05. Against a uniform expectation direction departs strongly (χ² = 580.1, df = 7,</w:t>
+      </w:r>
+      <w:r>
+        <w:t xml:space="preserve"> </w:t>
+      </w:r>
+      <w:r>
+        <w:rPr>
+          <w:i/>
+          <w:iCs/>
+        </w:rPr>
+        <w:t xml:space="preserve">P</w:t>
+      </w:r>
+      <w:r>
+        <w:t xml:space="preserve"> </w:t>
+      </w:r>
+      <w:r>
+        <w:t xml:space="preserve">= 4.6 × 10⁻¹²¹); against the geometric null only weakly (χ² = 10.8, Monte Carlo</w:t>
+      </w:r>
+      <w:r>
+        <w:t xml:space="preserve"> </w:t>
+      </w:r>
+      <w:r>
+        <w:rPr>
+          <w:i/>
+          <w:iCs/>
+        </w:rPr>
+        <w:t xml:space="preserve">P</w:t>
+      </w:r>
+      <w:r>
+        <w:t xml:space="preserve"> </w:t>
+      </w:r>
+      <w:r>
+        <w:t xml:space="preserve">= 0.039); against the geometry + effort null the departure points north (χ² = 25.8,</w:t>
+      </w:r>
+      <w:r>
+        <w:t xml:space="preserve"> </w:t>
+      </w:r>
+      <w:r>
+        <w:rPr>
+          <w:i/>
+          <w:iCs/>
+        </w:rPr>
+        <w:t xml:space="preserve">P</w:t>
+      </w:r>
+      <w:r>
+        <w:t xml:space="preserve"> </w:t>
+      </w:r>
+      <w:r>
+        <w:t xml:space="preserve">= 0.001).</w:t>
+      </w:r>
+      <w:r>
+        <w:t xml:space="preserve"> </w:t>
+      </w:r>
+      <w:r>
+        <w:rPr>
+          <w:b/>
+          <w:bCs/>
+        </w:rPr>
+        <w:t xml:space="preserve">c</w:t>
+      </w:r>
+      <w:r>
+        <w:t xml:space="preserve">, Observed shares for the six orders with most records; each polygon gives the share of that order’s own records per sector, and the key gives the numbers of records and species, because one species can contribute records in several provinces. Wind roses for the sixteen best-sampled orders are provided in the Supplementary Information.</w:t>
       </w:r>
     </w:p>
     <w:p>
@@ -3208,7 +3820,7 @@
         <w:t xml:space="preserve">a</w:t>
       </w:r>
       <w:r>
-        <w:t xml:space="preserve">, Province-year mean predicted hazard, 2002–2024.</w:t>
+        <w:t xml:space="preserve">, Province-year mean predicted hazard, 2002–2024, from the mechanistic and gradient-boosted models (Spearman ρ = 0.54).</w:t>
       </w:r>
       <w:r>
         <w:t xml:space="preserve"> </w:t>

</xml_diff>